<commit_message>
Build out Martin Lepage personal website
</commit_message>
<xml_diff>
--- a/public/files/Martin-Lepage-CV-2026.docx
+++ b/public/files/Martin-Lepage-CV-2026.docx
@@ -1199,7 +1199,7 @@
           <w:color w:val="111827"/>
           <w:sz w:val="22"/>
         </w:rPr>
-        <w:t>PhD, Social Sciences (Qualitative Sociology &amp; Queer Studies)</w:t>
+        <w:t>PhD, Religious Sciences</w:t>
       </w:r>
       <w:r>
         <w:t xml:space="preserve"> | UQAM | 2017</w:t>
@@ -1311,7 +1311,7 @@
           <w:color w:val="1F2937"/>
           <w:sz w:val="20"/>
         </w:rPr>
-        <w:t>Strategic AI Governance - Executive-Level Risk, Ethics &amp; Oversight, Coursera Professional Specialization</w:t>
+        <w:t>Strategic AI Governance - Executive-Level Risk, Ethics &amp; Oversight, Coursera Professional Specialization (in progress)</w:t>
       </w:r>
     </w:p>
     <w:p>

</xml_diff>